<commit_message>
Corrige le guide de test : agent comptabilité existe aussi en double (un par site)
Comme l'agent stock, il y a un agent comptabilité au Magasin de stock
et un au Comptoir, chacun rattaché à son site — la table des comptes à
créer avant le scénario en tenait compte à moitié (un seul compte
comptabilité listé sur trois au lieu de quatre comptes).

Co-Authored-By: Claude Sonnet 5 <noreply@anthropic.com>
Claude-Session: https://claude.ai/code/session_01D2wqqZvWBv11fi74dvZXfj
</commit_message>
<xml_diff>
--- a/GUIDE_TESTEUR_POSTES_ET_SCENARIO.docx
+++ b/GUIDE_TESTEUR_POSTES_ET_SCENARIO.docx
@@ -252,7 +252,7 @@
         <w:spacing w:after="140"/>
       </w:pPr>
       <w:r>
-        <w:t xml:space="preserve">Un compte par personne tenant la caisse/comptabilité (rattaché à un site précis) :</w:t>
+        <w:t xml:space="preserve">Comme pour l'agent stock, il y en a deux : un rattaché au Magasin de stock, un rattaché au Comptoir — chacun avec son propre compte, chacun ne voyant que les ventes et transactions de son site :</w:t>
       </w:r>
     </w:p>
     <w:p>
@@ -398,7 +398,7 @@
         <w:spacing w:after="140"/>
       </w:pPr>
       <w:r>
-        <w:t xml:space="preserve">Une fois connecté avec le compte responsable, créer 3 comptes supplémentaires depuis l'onglet Utilisateurs :</w:t>
+        <w:t xml:space="preserve">Une fois connecté avec le compte responsable, créer 4 comptes supplémentaires depuis l'onglet Utilisateurs (soit 5 comptes en tout avec le responsable — un par poste réel de la boutique) :</w:t>
       </w:r>
     </w:p>
     <w:tbl>
@@ -640,6 +640,71 @@
                 <w:sz w:val="18"/>
                 <w:szCs w:val="18"/>
               </w:rPr>
+              <w:t xml:space="preserve">magasin.compta</w:t>
+            </w:r>
+          </w:p>
+        </w:tc>
+        <w:tc>
+          <w:tcPr>
+            <w:tcW w:type="dxa" w:w="3300"/>
+            <w:shd w:fill="FFFFFF" w:val="clear"/>
+            <w:tcMar>
+              <w:top w:type="dxa" w:w="70"/>
+              <w:left w:type="dxa" w:w="80"/>
+              <w:bottom w:type="dxa" w:w="70"/>
+              <w:right w:type="dxa" w:w="80"/>
+            </w:tcMar>
+          </w:tcPr>
+          <w:p>
+            <w:r>
+              <w:rPr>
+                <w:sz w:val="18"/>
+                <w:szCs w:val="18"/>
+              </w:rPr>
+              <w:t xml:space="preserve">Agent comptabilité</w:t>
+            </w:r>
+          </w:p>
+        </w:tc>
+        <w:tc>
+          <w:tcPr>
+            <w:tcW w:type="dxa" w:w="3300"/>
+            <w:shd w:fill="FFFFFF" w:val="clear"/>
+            <w:tcMar>
+              <w:top w:type="dxa" w:w="70"/>
+              <w:left w:type="dxa" w:w="80"/>
+              <w:bottom w:type="dxa" w:w="70"/>
+              <w:right w:type="dxa" w:w="80"/>
+            </w:tcMar>
+          </w:tcPr>
+          <w:p>
+            <w:r>
+              <w:rPr>
+                <w:sz w:val="18"/>
+                <w:szCs w:val="18"/>
+              </w:rPr>
+              <w:t xml:space="preserve">Magasin de stock</w:t>
+            </w:r>
+          </w:p>
+        </w:tc>
+      </w:tr>
+      <w:tr>
+        <w:tc>
+          <w:tcPr>
+            <w:tcW w:type="dxa" w:w="3200"/>
+            <w:shd w:fill="F0EEE8" w:val="clear"/>
+            <w:tcMar>
+              <w:top w:type="dxa" w:w="70"/>
+              <w:left w:type="dxa" w:w="80"/>
+              <w:bottom w:type="dxa" w:w="70"/>
+              <w:right w:type="dxa" w:w="80"/>
+            </w:tcMar>
+          </w:tcPr>
+          <w:p>
+            <w:r>
+              <w:rPr>
+                <w:sz w:val="18"/>
+                <w:szCs w:val="18"/>
+              </w:rPr>
               <w:t xml:space="preserve">comptoir.compta</w:t>
             </w:r>
           </w:p>
@@ -647,7 +712,7 @@
         <w:tc>
           <w:tcPr>
             <w:tcW w:type="dxa" w:w="3300"/>
-            <w:shd w:fill="FFFFFF" w:val="clear"/>
+            <w:shd w:fill="F0EEE8" w:val="clear"/>
             <w:tcMar>
               <w:top w:type="dxa" w:w="70"/>
               <w:left w:type="dxa" w:w="80"/>
@@ -668,7 +733,7 @@
         <w:tc>
           <w:tcPr>
             <w:tcW w:type="dxa" w:w="3300"/>
-            <w:shd w:fill="FFFFFF" w:val="clear"/>
+            <w:shd w:fill="F0EEE8" w:val="clear"/>
             <w:tcMar>
               <w:top w:type="dxa" w:w="70"/>
               <w:left w:type="dxa" w:w="80"/>

</xml_diff>